<commit_message>
Roll plugin back to v0.1.0 skeleton and add versioned zip
Restores the entire repository tree to the v0.1.0 state (Stage 1 plugin
skeleton) via a snapshot commit, discarding the Stage 2-7 feature code
(Guard heuristics/scorer/quarantine, Watch scanner/alerts, Hub) from the
working tree while preserving full history. Adds kdna-sentinel-0.1.0.zip,
a distributable archive of the v0.1.0 plugin.

Co-Authored-By: Claude Opus 4.8 <noreply@anthropic.com>
Claude-Session: https://claude.ai/code/session_01JzytzNhKw1kayFpJncHYeo
</commit_message>
<xml_diff>
--- a/KDNA-Sentinel-Project-Brief.docx
+++ b/KDNA-Sentinel-Project-Brief.docx
@@ -359,7 +359,7 @@
           <w:sz w:val="21"/>
           <w:szCs w:val="21"/>
         </w:rPr>
-        <w:t xml:space="preserve">Stage 7 complete — Hub optional report-in + master dashboard. ALL STAGES COMPLETE. Off by default: when "Report to KDNA hub" is on, after each scan the client POSTs a compact, HMAC-signed metadata summary (site URL, plugin risk list, worst severity, timestamp — never content or PII) to the hub. When "This site is the KDNA hub" is on, a REST route /kdna-sentinel/v1/report verifies the HMAC against the shared secret, rejects unsigned/invalid, and stores accepted reports; the hub dashboard shows every reporting site (site, worst severity, at-risk count, longest patch lag, last check-in) and red-flags critical or stale sites. Nonce + capability on admin actions; HMAC on all machine traffic.</w:t>
+        <w:t xml:space="preserve">Stage 1 complete — activatable plugin skeleton: top-level "KDNA Sentinel" menu with Guard/Watch/Hub tabs, master enable toggles for Guard and Watch persisted in the kdna_sentinel_settings option, and the three custom tables created via dbDelta on activation. No detection or scanning logic yet.</w:t>
       </w:r>
     </w:p>
     <w:p>
@@ -388,7 +388,7 @@
           <w:sz w:val="21"/>
           <w:szCs w:val="21"/>
         </w:rPr>
-        <w:t xml:space="preserve">None — all seven stages (0-7) are complete.</w:t>
+        <w:t xml:space="preserve">Stage 2 — Guard: heuristics engine + form bindings.</w:t>
       </w:r>
     </w:p>
     <w:p>
@@ -417,7 +417,7 @@
           <w:sz w:val="21"/>
           <w:szCs w:val="21"/>
         </w:rPr>
-        <w:t xml:space="preserve">docs/kdna-forms-lifecycle.md; kdna-sentinel/ plugin — COMPLETE. Stage 7 added includes/watch/class-watch-hub.php (client reporter) and includes/hub/class-hub-endpoint.php (REST receiver + master dashboard), wired by class-watch.php (client) and class-sentinel-core.php (hub, on hub_is_hub); expanded Hub settings (report toggle, hub URL, shared secret, this-site-is-hub) in class-sentinel-core.php, class-sentinel-settings.php and admin/views/tab-hub.php. Every file in the Section 3 tree now exists.</w:t>
+        <w:t xml:space="preserve">docs/kdna-forms-lifecycle.md; kdna-sentinel/ plugin — kdna-sentinel.php, uninstall.php, README.txt, includes/class-sentinel-activator.php, includes/class-sentinel-core.php, includes/class-sentinel-settings.php, admin/admin-style.css, admin/views/ (settings-page, tab-guard, tab-watch, tab-hub), assets/js/admin.js, and empty guard/watch/hub module dirs.</w:t>
       </w:r>
     </w:p>
     <w:p>
@@ -674,450 +674,6 @@
                 <w:szCs w:val="19"/>
               </w:rPr>
               <w:t xml:space="preserve">Standard WordPress practice and required by the brief's own rules (custom tables removed only on uninstall; lean main file). Architecture unchanged.</w:t>
-            </w:r>
-          </w:p>
-        </w:tc>
-      </w:tr>
-      <w:tr>
-        <w:tc>
-          <w:tcPr>
-            <w:tcW w:type="dxa" w:w="1400"/>
-            <w:shd w:fill="FFFFFF" w:val="clear"/>
-            <w:tcMar>
-              <w:top w:type="dxa" w:w="60"/>
-              <w:left w:type="dxa" w:w="100"/>
-              <w:bottom w:type="dxa" w:w="60"/>
-              <w:right w:type="dxa" w:w="100"/>
-            </w:tcMar>
-          </w:tcPr>
-          <w:p>
-            <w:r>
-              <w:rPr>
-                <w:b w:val="false"/>
-                <w:bCs w:val="false"/>
-                <w:color w:val="222222"/>
-                <w:sz w:val="19"/>
-                <w:szCs w:val="19"/>
-              </w:rPr>
-              <w:t xml:space="preserve">Stage 2</w:t>
-            </w:r>
-          </w:p>
-        </w:tc>
-        <w:tc>
-          <w:tcPr>
-            <w:tcW w:type="dxa" w:w="4400"/>
-            <w:shd w:fill="FFFFFF" w:val="clear"/>
-            <w:tcMar>
-              <w:top w:type="dxa" w:w="60"/>
-              <w:left w:type="dxa" w:w="100"/>
-              <w:bottom w:type="dxa" w:w="60"/>
-              <w:right w:type="dxa" w:w="100"/>
-            </w:tcMar>
-          </w:tcPr>
-          <w:p>
-            <w:r>
-              <w:rPr>
-                <w:b w:val="false"/>
-                <w:bCs w:val="false"/>
-                <w:color w:val="222222"/>
-                <w:sz w:val="19"/>
-                <w:szCs w:val="19"/>
-              </w:rPr>
-              <w:t xml:space="preserve">Added includes/guard/class-guard-verdict.php (the 'verdict object' the brief refers to). Interaction detection uses a small inline script injected alongside the honeypot.</w:t>
-            </w:r>
-          </w:p>
-        </w:tc>
-        <w:tc>
-          <w:tcPr>
-            <w:tcW w:type="dxa" w:w="3200"/>
-            <w:shd w:fill="FFFFFF" w:val="clear"/>
-            <w:tcMar>
-              <w:top w:type="dxa" w:w="60"/>
-              <w:left w:type="dxa" w:w="100"/>
-              <w:bottom w:type="dxa" w:w="60"/>
-              <w:right w:type="dxa" w:w="100"/>
-            </w:tcMar>
-          </w:tcPr>
-          <w:p>
-            <w:r>
-              <w:rPr>
-                <w:b w:val="false"/>
-                <w:bCs w:val="false"/>
-                <w:color w:val="222222"/>
-                <w:sz w:val="19"/>
-                <w:szCs w:val="19"/>
-              </w:rPr>
-              <w:t xml:space="preserve">'No interaction' and 'no reliable timing' are treated as soft signals (BORDERLINE), not hard blocks, so no-JS / cached-page visitors are never blocked outright. Honeypot, blocklisted IP and sub-threshold timing remain hard blocks. This reconciles Section 4's flow with the fail-open rule.</w:t>
-            </w:r>
-          </w:p>
-        </w:tc>
-      </w:tr>
-      <w:tr>
-        <w:tc>
-          <w:tcPr>
-            <w:tcW w:type="dxa" w:w="1400"/>
-            <w:shd w:fill="FFFFFF" w:val="clear"/>
-            <w:tcMar>
-              <w:top w:type="dxa" w:w="60"/>
-              <w:left w:type="dxa" w:w="100"/>
-              <w:bottom w:type="dxa" w:w="60"/>
-              <w:right w:type="dxa" w:w="100"/>
-            </w:tcMar>
-          </w:tcPr>
-          <w:p>
-            <w:r>
-              <w:rPr>
-                <w:b w:val="false"/>
-                <w:bCs w:val="false"/>
-                <w:color w:val="222222"/>
-                <w:sz w:val="19"/>
-                <w:szCs w:val="19"/>
-              </w:rPr>
-              <w:t xml:space="preserve">Stage 3</w:t>
-            </w:r>
-          </w:p>
-        </w:tc>
-        <w:tc>
-          <w:tcPr>
-            <w:tcW w:type="dxa" w:w="4400"/>
-            <w:shd w:fill="FFFFFF" w:val="clear"/>
-            <w:tcMar>
-              <w:top w:type="dxa" w:w="60"/>
-              <w:left w:type="dxa" w:w="100"/>
-              <w:bottom w:type="dxa" w:w="60"/>
-              <w:right w:type="dxa" w:w="100"/>
-            </w:tcMar>
-          </w:tcPr>
-          <w:p>
-            <w:r>
-              <w:rPr>
-                <w:b w:val="false"/>
-                <w:bCs w:val="false"/>
-                <w:color w:val="222222"/>
-                <w:sz w:val="19"/>
-                <w:szCs w:val="19"/>
-              </w:rPr>
-              <w:t xml:space="preserve">Model default set to claude-haiku-4-5 (current Haiku-class ID); the API is called via WordPress' wp_remote_post rather than the Anthropic SDK, and the reply is validated by a tight JSON-only prompt plus defensive parsing (no structured-outputs dependency).</w:t>
-            </w:r>
-          </w:p>
-        </w:tc>
-        <w:tc>
-          <w:tcPr>
-            <w:tcW w:type="dxa" w:w="3200"/>
-            <w:shd w:fill="FFFFFF" w:val="clear"/>
-            <w:tcMar>
-              <w:top w:type="dxa" w:w="60"/>
-              <w:left w:type="dxa" w:w="100"/>
-              <w:bottom w:type="dxa" w:w="60"/>
-              <w:right w:type="dxa" w:w="100"/>
-            </w:tcMar>
-          </w:tcPr>
-          <w:p>
-            <w:r>
-              <w:rPr>
-                <w:b w:val="false"/>
-                <w:bCs w:val="false"/>
-                <w:color w:val="222222"/>
-                <w:sz w:val="19"/>
-                <w:szCs w:val="19"/>
-              </w:rPr>
-              <w:t xml:space="preserve">The brief specifies a Haiku-class model without pinning an ID. wp_remote_post is the correct, dependency-free transport for a WordPress plugin (Section 3: no external libraries). Model name is admin-configurable, so the ID can be changed without code edits.</w:t>
-            </w:r>
-          </w:p>
-        </w:tc>
-      </w:tr>
-      <w:tr>
-        <w:tc>
-          <w:tcPr>
-            <w:tcW w:type="dxa" w:w="1400"/>
-            <w:shd w:fill="FFFFFF" w:val="clear"/>
-            <w:tcMar>
-              <w:top w:type="dxa" w:w="60"/>
-              <w:left w:type="dxa" w:w="100"/>
-              <w:bottom w:type="dxa" w:w="60"/>
-              <w:right w:type="dxa" w:w="100"/>
-            </w:tcMar>
-          </w:tcPr>
-          <w:p>
-            <w:r>
-              <w:rPr>
-                <w:b w:val="false"/>
-                <w:bCs w:val="false"/>
-                <w:color w:val="222222"/>
-                <w:sz w:val="19"/>
-                <w:szCs w:val="19"/>
-              </w:rPr>
-              <w:t xml:space="preserve">Stage 4</w:t>
-            </w:r>
-          </w:p>
-        </w:tc>
-        <w:tc>
-          <w:tcPr>
-            <w:tcW w:type="dxa" w:w="4400"/>
-            <w:shd w:fill="FFFFFF" w:val="clear"/>
-            <w:tcMar>
-              <w:top w:type="dxa" w:w="60"/>
-              <w:left w:type="dxa" w:w="100"/>
-              <w:bottom w:type="dxa" w:w="60"/>
-              <w:right w:type="dxa" w:w="100"/>
-            </w:tcMar>
-          </w:tcPr>
-          <w:p>
-            <w:r>
-              <w:rPr>
-                <w:b w:val="false"/>
-                <w:bCs w:val="false"/>
-                <w:color w:val="222222"/>
-                <w:sz w:val="19"/>
-                <w:szCs w:val="19"/>
-              </w:rPr>
-              <w:t xml:space="preserve">Release re-runs the genuine path faithfully for KDNA Forms (un-flag the stored entry + re-send notifications). For WooCommerce sources (registration/login/lost-password/checkout/review) release emails the site admin the captured details instead of programmatically re-completing the account/order/review. Added a class-guard-quarantine-list-table.php helper (WP_List_Table subclass) beyond the Section 3 tree.</w:t>
-            </w:r>
-          </w:p>
-        </w:tc>
-        <w:tc>
-          <w:tcPr>
-            <w:tcW w:type="dxa" w:w="3200"/>
-            <w:shd w:fill="FFFFFF" w:val="clear"/>
-            <w:tcMar>
-              <w:top w:type="dxa" w:w="60"/>
-              <w:left w:type="dxa" w:w="100"/>
-              <w:bottom w:type="dxa" w:w="60"/>
-              <w:right w:type="dxa" w:w="100"/>
-            </w:tcMar>
-          </w:tcPr>
-          <w:p>
-            <w:r>
-              <w:rPr>
-                <w:b w:val="false"/>
-                <w:bCs w:val="false"/>
-                <w:color w:val="222222"/>
-                <w:sz w:val="19"/>
-                <w:szCs w:val="19"/>
-              </w:rPr>
-              <w:t xml:space="preserve">WooCommerce account/checkout/review actions can't be safely or faithfully replayed from a privacy-limited payload (passwords and payment data are deliberately never stored), so releasing notifies a human. A kdna_sentinel_guard_release filter lets a site fully handle any source. The list-table subclass is the standard way to render a WP admin list.</w:t>
-            </w:r>
-          </w:p>
-        </w:tc>
-      </w:tr>
-      <w:tr>
-        <w:tc>
-          <w:tcPr>
-            <w:tcW w:type="dxa" w:w="1400"/>
-            <w:shd w:fill="FFFFFF" w:val="clear"/>
-            <w:tcMar>
-              <w:top w:type="dxa" w:w="60"/>
-              <w:left w:type="dxa" w:w="100"/>
-              <w:bottom w:type="dxa" w:w="60"/>
-              <w:right w:type="dxa" w:w="100"/>
-            </w:tcMar>
-          </w:tcPr>
-          <w:p>
-            <w:r>
-              <w:rPr>
-                <w:b w:val="false"/>
-                <w:bCs w:val="false"/>
-                <w:color w:val="222222"/>
-                <w:sz w:val="19"/>
-                <w:szCs w:val="19"/>
-              </w:rPr>
-              <w:t xml:space="preserve">Stage 5</w:t>
-            </w:r>
-          </w:p>
-        </w:tc>
-        <w:tc>
-          <w:tcPr>
-            <w:tcW w:type="dxa" w:w="4400"/>
-            <w:shd w:fill="FFFFFF" w:val="clear"/>
-            <w:tcMar>
-              <w:top w:type="dxa" w:w="60"/>
-              <w:left w:type="dxa" w:w="100"/>
-              <w:bottom w:type="dxa" w:w="60"/>
-              <w:right w:type="dxa" w:w="100"/>
-            </w:tcMar>
-          </w:tcPr>
-          <w:p>
-            <w:r>
-              <w:rPr>
-                <w:b w:val="false"/>
-                <w:bCs w:val="false"/>
-                <w:color w:val="222222"/>
-                <w:sz w:val="19"/>
-                <w:szCs w:val="19"/>
-              </w:rPr>
-              <w:t xml:space="preserve">Added a fixed_at column to the vuln_cache table (schema v2) and an includes/watch/class-watch-providers.php file beyond the Section 3 tree. Patchstack field mapping is best-effort; WPScan is the primary, precisely-modelled provider.</w:t>
-            </w:r>
-          </w:p>
-        </w:tc>
-        <w:tc>
-          <w:tcPr>
-            <w:tcW w:type="dxa" w:w="3200"/>
-            <w:shd w:fill="FFFFFF" w:val="clear"/>
-            <w:tcMar>
-              <w:top w:type="dxa" w:w="60"/>
-              <w:left w:type="dxa" w:w="100"/>
-              <w:bottom w:type="dxa" w:w="60"/>
-              <w:right w:type="dxa" w:w="100"/>
-            </w:tcMar>
-          </w:tcPr>
-          <w:p>
-            <w:r>
-              <w:rPr>
-                <w:b w:val="false"/>
-                <w:bCs w:val="false"/>
-                <w:color w:val="222222"/>
-                <w:sz w:val="19"/>
-                <w:szCs w:val="19"/>
-              </w:rPr>
-              <w:t xml:space="preserve">The Section 3 vuln_cache schema has no fix-date column, but 'patch lag' (days since the fix was available) requires one; maybe_upgrade re-runs dbDelta to add it. The providers file houses the one-interface / swappable-implementation requirement. Patchstack's exact API JSON couldn't be verified offline, so its parser is defensive and easy to adjust; the interface makes swapping trivial.</w:t>
-            </w:r>
-          </w:p>
-        </w:tc>
-      </w:tr>
-      <w:tr>
-        <w:tc>
-          <w:tcPr>
-            <w:tcW w:type="dxa" w:w="1400"/>
-            <w:shd w:fill="FFFFFF" w:val="clear"/>
-            <w:tcMar>
-              <w:top w:type="dxa" w:w="60"/>
-              <w:left w:type="dxa" w:w="100"/>
-              <w:bottom w:type="dxa" w:w="60"/>
-              <w:right w:type="dxa" w:w="100"/>
-            </w:tcMar>
-          </w:tcPr>
-          <w:p>
-            <w:r>
-              <w:rPr>
-                <w:b w:val="false"/>
-                <w:bCs w:val="false"/>
-                <w:color w:val="222222"/>
-                <w:sz w:val="19"/>
-                <w:szCs w:val="19"/>
-              </w:rPr>
-              <w:t xml:space="preserve">Stage 6</w:t>
-            </w:r>
-          </w:p>
-        </w:tc>
-        <w:tc>
-          <w:tcPr>
-            <w:tcW w:type="dxa" w:w="4400"/>
-            <w:shd w:fill="FFFFFF" w:val="clear"/>
-            <w:tcMar>
-              <w:top w:type="dxa" w:w="60"/>
-              <w:left w:type="dxa" w:w="100"/>
-              <w:bottom w:type="dxa" w:w="60"/>
-              <w:right w:type="dxa" w:w="100"/>
-            </w:tcMar>
-          </w:tcPr>
-          <w:p>
-            <w:r>
-              <w:rPr>
-                <w:b w:val="false"/>
-                <w:bCs w:val="false"/>
-                <w:color w:val="222222"/>
-                <w:sz w:val="19"/>
-                <w:szCs w:val="19"/>
-              </w:rPr>
-              <w:t xml:space="preserve">The digest runs on a single daily wp-cron that self-gates on the chosen frequency and the last-sent date (rather than rescheduling the cron when the frequency setting changes).</w:t>
-            </w:r>
-          </w:p>
-        </w:tc>
-        <w:tc>
-          <w:tcPr>
-            <w:tcW w:type="dxa" w:w="3200"/>
-            <w:shd w:fill="FFFFFF" w:val="clear"/>
-            <w:tcMar>
-              <w:top w:type="dxa" w:w="60"/>
-              <w:left w:type="dxa" w:w="100"/>
-              <w:bottom w:type="dxa" w:w="60"/>
-              <w:right w:type="dxa" w:w="100"/>
-            </w:tcMar>
-          </w:tcPr>
-          <w:p>
-            <w:r>
-              <w:rPr>
-                <w:b w:val="false"/>
-                <w:bCs w:val="false"/>
-                <w:color w:val="222222"/>
-                <w:sz w:val="19"/>
-                <w:szCs w:val="19"/>
-              </w:rPr>
-              <w:t xml:space="preserve">Gating one daily job is more robust than re-scheduling on every settings save: a frequency change takes effect immediately with no dangling schedules, and a weekly digest still fires roughly every 7 days regardless of when the setting changed. Behaviour (daily vs weekly) matches the brief.</w:t>
-            </w:r>
-          </w:p>
-        </w:tc>
-      </w:tr>
-      <w:tr>
-        <w:tc>
-          <w:tcPr>
-            <w:tcW w:type="dxa" w:w="1400"/>
-            <w:shd w:fill="FFFFFF" w:val="clear"/>
-            <w:tcMar>
-              <w:top w:type="dxa" w:w="60"/>
-              <w:left w:type="dxa" w:w="100"/>
-              <w:bottom w:type="dxa" w:w="60"/>
-              <w:right w:type="dxa" w:w="100"/>
-            </w:tcMar>
-          </w:tcPr>
-          <w:p>
-            <w:r>
-              <w:rPr>
-                <w:b w:val="false"/>
-                <w:bCs w:val="false"/>
-                <w:color w:val="222222"/>
-                <w:sz w:val="19"/>
-                <w:szCs w:val="19"/>
-              </w:rPr>
-              <w:t xml:space="preserve">Stage 7</w:t>
-            </w:r>
-          </w:p>
-        </w:tc>
-        <w:tc>
-          <w:tcPr>
-            <w:tcW w:type="dxa" w:w="4400"/>
-            <w:shd w:fill="FFFFFF" w:val="clear"/>
-            <w:tcMar>
-              <w:top w:type="dxa" w:w="60"/>
-              <w:left w:type="dxa" w:w="100"/>
-              <w:bottom w:type="dxa" w:w="60"/>
-              <w:right w:type="dxa" w:w="100"/>
-            </w:tcMar>
-          </w:tcPr>
-          <w:p>
-            <w:r>
-              <w:rPr>
-                <w:b w:val="false"/>
-                <w:bCs w:val="false"/>
-                <w:color w:val="222222"/>
-                <w:sz w:val="19"/>
-                <w:szCs w:val="19"/>
-              </w:rPr>
-              <w:t xml:space="preserve">The client posts to {hub_url}/wp-json/kdna-sentinel/v1/report (standard REST path) as a non-blocking fire-and-forget request, and the hub stale-check-in threshold is 2 days.</w:t>
-            </w:r>
-          </w:p>
-        </w:tc>
-        <w:tc>
-          <w:tcPr>
-            <w:tcW w:type="dxa" w:w="3200"/>
-            <w:shd w:fill="FFFFFF" w:val="clear"/>
-            <w:tcMar>
-              <w:top w:type="dxa" w:w="60"/>
-              <w:left w:type="dxa" w:w="100"/>
-              <w:bottom w:type="dxa" w:w="60"/>
-              <w:right w:type="dxa" w:w="100"/>
-            </w:tcMar>
-          </w:tcPr>
-          <w:p>
-            <w:r>
-              <w:rPr>
-                <w:b w:val="false"/>
-                <w:bCs w:val="false"/>
-                <w:color w:val="222222"/>
-                <w:sz w:val="19"/>
-                <w:szCs w:val="19"/>
-              </w:rPr>
-              <w:t xml:space="preserve">Non-blocking keeps a scan from being slowed by the hub round-trip; the HMAC is still sent and the hub logs receipt, so delivery confirmation isn't needed. The standard /wp-json/ REST base covers the vast majority of installs. 2 days matches the daily report cadence (a site that misses ~2 daily reports is genuinely stale).</w:t>
             </w:r>
           </w:p>
         </w:tc>

</xml_diff>

<commit_message>
Release the complete plugin as version 0.1.0
Restores the full Guard + Watch + Hub feature set and relabels it as a
single 0.1.0 release. The 0.1-0.7 numbers were stage-build milestones,
not shippable releases; this is the first complete, usable release, so it
carries version 0.1.0.

- Plugin header and KDNA_SENTINEL_VERSION set to 0.1.0 (DB schema version
  left at 2 — it is internal and unrelated to the release number).
- README changelog collapsed into a single 0.1.0 entry describing the
  complete feature set; build-status section replaced with "What's included".
- Rebuilt kdna-sentinel-0.1.0.zip containing the full plugin.

Co-Authored-By: Claude Opus 4.8 <noreply@anthropic.com>
Claude-Session: https://claude.ai/code/session_01JzytzNhKw1kayFpJncHYeo
</commit_message>
<xml_diff>
--- a/KDNA-Sentinel-Project-Brief.docx
+++ b/KDNA-Sentinel-Project-Brief.docx
@@ -359,7 +359,7 @@
           <w:sz w:val="21"/>
           <w:szCs w:val="21"/>
         </w:rPr>
-        <w:t xml:space="preserve">Stage 1 complete — activatable plugin skeleton: top-level "KDNA Sentinel" menu with Guard/Watch/Hub tabs, master enable toggles for Guard and Watch persisted in the kdna_sentinel_settings option, and the three custom tables created via dbDelta on activation. No detection or scanning logic yet.</w:t>
+        <w:t xml:space="preserve">Stage 7 complete — Hub optional report-in + master dashboard. ALL STAGES COMPLETE. Off by default: when "Report to KDNA hub" is on, after each scan the client POSTs a compact, HMAC-signed metadata summary (site URL, plugin risk list, worst severity, timestamp — never content or PII) to the hub. When "This site is the KDNA hub" is on, a REST route /kdna-sentinel/v1/report verifies the HMAC against the shared secret, rejects unsigned/invalid, and stores accepted reports; the hub dashboard shows every reporting site (site, worst severity, at-risk count, longest patch lag, last check-in) and red-flags critical or stale sites. Nonce + capability on admin actions; HMAC on all machine traffic.</w:t>
       </w:r>
     </w:p>
     <w:p>
@@ -388,7 +388,7 @@
           <w:sz w:val="21"/>
           <w:szCs w:val="21"/>
         </w:rPr>
-        <w:t xml:space="preserve">Stage 2 — Guard: heuristics engine + form bindings.</w:t>
+        <w:t xml:space="preserve">None — all seven stages (0-7) are complete.</w:t>
       </w:r>
     </w:p>
     <w:p>
@@ -417,7 +417,7 @@
           <w:sz w:val="21"/>
           <w:szCs w:val="21"/>
         </w:rPr>
-        <w:t xml:space="preserve">docs/kdna-forms-lifecycle.md; kdna-sentinel/ plugin — kdna-sentinel.php, uninstall.php, README.txt, includes/class-sentinel-activator.php, includes/class-sentinel-core.php, includes/class-sentinel-settings.php, admin/admin-style.css, admin/views/ (settings-page, tab-guard, tab-watch, tab-hub), assets/js/admin.js, and empty guard/watch/hub module dirs.</w:t>
+        <w:t xml:space="preserve">docs/kdna-forms-lifecycle.md; kdna-sentinel/ plugin — COMPLETE. Stage 7 added includes/watch/class-watch-hub.php (client reporter) and includes/hub/class-hub-endpoint.php (REST receiver + master dashboard), wired by class-watch.php (client) and class-sentinel-core.php (hub, on hub_is_hub); expanded Hub settings (report toggle, hub URL, shared secret, this-site-is-hub) in class-sentinel-core.php, class-sentinel-settings.php and admin/views/tab-hub.php. Every file in the Section 3 tree now exists.</w:t>
       </w:r>
     </w:p>
     <w:p>
@@ -674,6 +674,450 @@
                 <w:szCs w:val="19"/>
               </w:rPr>
               <w:t xml:space="preserve">Standard WordPress practice and required by the brief's own rules (custom tables removed only on uninstall; lean main file). Architecture unchanged.</w:t>
+            </w:r>
+          </w:p>
+        </w:tc>
+      </w:tr>
+      <w:tr>
+        <w:tc>
+          <w:tcPr>
+            <w:tcW w:type="dxa" w:w="1400"/>
+            <w:shd w:fill="FFFFFF" w:val="clear"/>
+            <w:tcMar>
+              <w:top w:type="dxa" w:w="60"/>
+              <w:left w:type="dxa" w:w="100"/>
+              <w:bottom w:type="dxa" w:w="60"/>
+              <w:right w:type="dxa" w:w="100"/>
+            </w:tcMar>
+          </w:tcPr>
+          <w:p>
+            <w:r>
+              <w:rPr>
+                <w:b w:val="false"/>
+                <w:bCs w:val="false"/>
+                <w:color w:val="222222"/>
+                <w:sz w:val="19"/>
+                <w:szCs w:val="19"/>
+              </w:rPr>
+              <w:t xml:space="preserve">Stage 2</w:t>
+            </w:r>
+          </w:p>
+        </w:tc>
+        <w:tc>
+          <w:tcPr>
+            <w:tcW w:type="dxa" w:w="4400"/>
+            <w:shd w:fill="FFFFFF" w:val="clear"/>
+            <w:tcMar>
+              <w:top w:type="dxa" w:w="60"/>
+              <w:left w:type="dxa" w:w="100"/>
+              <w:bottom w:type="dxa" w:w="60"/>
+              <w:right w:type="dxa" w:w="100"/>
+            </w:tcMar>
+          </w:tcPr>
+          <w:p>
+            <w:r>
+              <w:rPr>
+                <w:b w:val="false"/>
+                <w:bCs w:val="false"/>
+                <w:color w:val="222222"/>
+                <w:sz w:val="19"/>
+                <w:szCs w:val="19"/>
+              </w:rPr>
+              <w:t xml:space="preserve">Added includes/guard/class-guard-verdict.php (the 'verdict object' the brief refers to). Interaction detection uses a small inline script injected alongside the honeypot.</w:t>
+            </w:r>
+          </w:p>
+        </w:tc>
+        <w:tc>
+          <w:tcPr>
+            <w:tcW w:type="dxa" w:w="3200"/>
+            <w:shd w:fill="FFFFFF" w:val="clear"/>
+            <w:tcMar>
+              <w:top w:type="dxa" w:w="60"/>
+              <w:left w:type="dxa" w:w="100"/>
+              <w:bottom w:type="dxa" w:w="60"/>
+              <w:right w:type="dxa" w:w="100"/>
+            </w:tcMar>
+          </w:tcPr>
+          <w:p>
+            <w:r>
+              <w:rPr>
+                <w:b w:val="false"/>
+                <w:bCs w:val="false"/>
+                <w:color w:val="222222"/>
+                <w:sz w:val="19"/>
+                <w:szCs w:val="19"/>
+              </w:rPr>
+              <w:t xml:space="preserve">'No interaction' and 'no reliable timing' are treated as soft signals (BORDERLINE), not hard blocks, so no-JS / cached-page visitors are never blocked outright. Honeypot, blocklisted IP and sub-threshold timing remain hard blocks. This reconciles Section 4's flow with the fail-open rule.</w:t>
+            </w:r>
+          </w:p>
+        </w:tc>
+      </w:tr>
+      <w:tr>
+        <w:tc>
+          <w:tcPr>
+            <w:tcW w:type="dxa" w:w="1400"/>
+            <w:shd w:fill="FFFFFF" w:val="clear"/>
+            <w:tcMar>
+              <w:top w:type="dxa" w:w="60"/>
+              <w:left w:type="dxa" w:w="100"/>
+              <w:bottom w:type="dxa" w:w="60"/>
+              <w:right w:type="dxa" w:w="100"/>
+            </w:tcMar>
+          </w:tcPr>
+          <w:p>
+            <w:r>
+              <w:rPr>
+                <w:b w:val="false"/>
+                <w:bCs w:val="false"/>
+                <w:color w:val="222222"/>
+                <w:sz w:val="19"/>
+                <w:szCs w:val="19"/>
+              </w:rPr>
+              <w:t xml:space="preserve">Stage 3</w:t>
+            </w:r>
+          </w:p>
+        </w:tc>
+        <w:tc>
+          <w:tcPr>
+            <w:tcW w:type="dxa" w:w="4400"/>
+            <w:shd w:fill="FFFFFF" w:val="clear"/>
+            <w:tcMar>
+              <w:top w:type="dxa" w:w="60"/>
+              <w:left w:type="dxa" w:w="100"/>
+              <w:bottom w:type="dxa" w:w="60"/>
+              <w:right w:type="dxa" w:w="100"/>
+            </w:tcMar>
+          </w:tcPr>
+          <w:p>
+            <w:r>
+              <w:rPr>
+                <w:b w:val="false"/>
+                <w:bCs w:val="false"/>
+                <w:color w:val="222222"/>
+                <w:sz w:val="19"/>
+                <w:szCs w:val="19"/>
+              </w:rPr>
+              <w:t xml:space="preserve">Model default set to claude-haiku-4-5 (current Haiku-class ID); the API is called via WordPress' wp_remote_post rather than the Anthropic SDK, and the reply is validated by a tight JSON-only prompt plus defensive parsing (no structured-outputs dependency).</w:t>
+            </w:r>
+          </w:p>
+        </w:tc>
+        <w:tc>
+          <w:tcPr>
+            <w:tcW w:type="dxa" w:w="3200"/>
+            <w:shd w:fill="FFFFFF" w:val="clear"/>
+            <w:tcMar>
+              <w:top w:type="dxa" w:w="60"/>
+              <w:left w:type="dxa" w:w="100"/>
+              <w:bottom w:type="dxa" w:w="60"/>
+              <w:right w:type="dxa" w:w="100"/>
+            </w:tcMar>
+          </w:tcPr>
+          <w:p>
+            <w:r>
+              <w:rPr>
+                <w:b w:val="false"/>
+                <w:bCs w:val="false"/>
+                <w:color w:val="222222"/>
+                <w:sz w:val="19"/>
+                <w:szCs w:val="19"/>
+              </w:rPr>
+              <w:t xml:space="preserve">The brief specifies a Haiku-class model without pinning an ID. wp_remote_post is the correct, dependency-free transport for a WordPress plugin (Section 3: no external libraries). Model name is admin-configurable, so the ID can be changed without code edits.</w:t>
+            </w:r>
+          </w:p>
+        </w:tc>
+      </w:tr>
+      <w:tr>
+        <w:tc>
+          <w:tcPr>
+            <w:tcW w:type="dxa" w:w="1400"/>
+            <w:shd w:fill="FFFFFF" w:val="clear"/>
+            <w:tcMar>
+              <w:top w:type="dxa" w:w="60"/>
+              <w:left w:type="dxa" w:w="100"/>
+              <w:bottom w:type="dxa" w:w="60"/>
+              <w:right w:type="dxa" w:w="100"/>
+            </w:tcMar>
+          </w:tcPr>
+          <w:p>
+            <w:r>
+              <w:rPr>
+                <w:b w:val="false"/>
+                <w:bCs w:val="false"/>
+                <w:color w:val="222222"/>
+                <w:sz w:val="19"/>
+                <w:szCs w:val="19"/>
+              </w:rPr>
+              <w:t xml:space="preserve">Stage 4</w:t>
+            </w:r>
+          </w:p>
+        </w:tc>
+        <w:tc>
+          <w:tcPr>
+            <w:tcW w:type="dxa" w:w="4400"/>
+            <w:shd w:fill="FFFFFF" w:val="clear"/>
+            <w:tcMar>
+              <w:top w:type="dxa" w:w="60"/>
+              <w:left w:type="dxa" w:w="100"/>
+              <w:bottom w:type="dxa" w:w="60"/>
+              <w:right w:type="dxa" w:w="100"/>
+            </w:tcMar>
+          </w:tcPr>
+          <w:p>
+            <w:r>
+              <w:rPr>
+                <w:b w:val="false"/>
+                <w:bCs w:val="false"/>
+                <w:color w:val="222222"/>
+                <w:sz w:val="19"/>
+                <w:szCs w:val="19"/>
+              </w:rPr>
+              <w:t xml:space="preserve">Release re-runs the genuine path faithfully for KDNA Forms (un-flag the stored entry + re-send notifications). For WooCommerce sources (registration/login/lost-password/checkout/review) release emails the site admin the captured details instead of programmatically re-completing the account/order/review. Added a class-guard-quarantine-list-table.php helper (WP_List_Table subclass) beyond the Section 3 tree.</w:t>
+            </w:r>
+          </w:p>
+        </w:tc>
+        <w:tc>
+          <w:tcPr>
+            <w:tcW w:type="dxa" w:w="3200"/>
+            <w:shd w:fill="FFFFFF" w:val="clear"/>
+            <w:tcMar>
+              <w:top w:type="dxa" w:w="60"/>
+              <w:left w:type="dxa" w:w="100"/>
+              <w:bottom w:type="dxa" w:w="60"/>
+              <w:right w:type="dxa" w:w="100"/>
+            </w:tcMar>
+          </w:tcPr>
+          <w:p>
+            <w:r>
+              <w:rPr>
+                <w:b w:val="false"/>
+                <w:bCs w:val="false"/>
+                <w:color w:val="222222"/>
+                <w:sz w:val="19"/>
+                <w:szCs w:val="19"/>
+              </w:rPr>
+              <w:t xml:space="preserve">WooCommerce account/checkout/review actions can't be safely or faithfully replayed from a privacy-limited payload (passwords and payment data are deliberately never stored), so releasing notifies a human. A kdna_sentinel_guard_release filter lets a site fully handle any source. The list-table subclass is the standard way to render a WP admin list.</w:t>
+            </w:r>
+          </w:p>
+        </w:tc>
+      </w:tr>
+      <w:tr>
+        <w:tc>
+          <w:tcPr>
+            <w:tcW w:type="dxa" w:w="1400"/>
+            <w:shd w:fill="FFFFFF" w:val="clear"/>
+            <w:tcMar>
+              <w:top w:type="dxa" w:w="60"/>
+              <w:left w:type="dxa" w:w="100"/>
+              <w:bottom w:type="dxa" w:w="60"/>
+              <w:right w:type="dxa" w:w="100"/>
+            </w:tcMar>
+          </w:tcPr>
+          <w:p>
+            <w:r>
+              <w:rPr>
+                <w:b w:val="false"/>
+                <w:bCs w:val="false"/>
+                <w:color w:val="222222"/>
+                <w:sz w:val="19"/>
+                <w:szCs w:val="19"/>
+              </w:rPr>
+              <w:t xml:space="preserve">Stage 5</w:t>
+            </w:r>
+          </w:p>
+        </w:tc>
+        <w:tc>
+          <w:tcPr>
+            <w:tcW w:type="dxa" w:w="4400"/>
+            <w:shd w:fill="FFFFFF" w:val="clear"/>
+            <w:tcMar>
+              <w:top w:type="dxa" w:w="60"/>
+              <w:left w:type="dxa" w:w="100"/>
+              <w:bottom w:type="dxa" w:w="60"/>
+              <w:right w:type="dxa" w:w="100"/>
+            </w:tcMar>
+          </w:tcPr>
+          <w:p>
+            <w:r>
+              <w:rPr>
+                <w:b w:val="false"/>
+                <w:bCs w:val="false"/>
+                <w:color w:val="222222"/>
+                <w:sz w:val="19"/>
+                <w:szCs w:val="19"/>
+              </w:rPr>
+              <w:t xml:space="preserve">Added a fixed_at column to the vuln_cache table (schema v2) and an includes/watch/class-watch-providers.php file beyond the Section 3 tree. Patchstack field mapping is best-effort; WPScan is the primary, precisely-modelled provider.</w:t>
+            </w:r>
+          </w:p>
+        </w:tc>
+        <w:tc>
+          <w:tcPr>
+            <w:tcW w:type="dxa" w:w="3200"/>
+            <w:shd w:fill="FFFFFF" w:val="clear"/>
+            <w:tcMar>
+              <w:top w:type="dxa" w:w="60"/>
+              <w:left w:type="dxa" w:w="100"/>
+              <w:bottom w:type="dxa" w:w="60"/>
+              <w:right w:type="dxa" w:w="100"/>
+            </w:tcMar>
+          </w:tcPr>
+          <w:p>
+            <w:r>
+              <w:rPr>
+                <w:b w:val="false"/>
+                <w:bCs w:val="false"/>
+                <w:color w:val="222222"/>
+                <w:sz w:val="19"/>
+                <w:szCs w:val="19"/>
+              </w:rPr>
+              <w:t xml:space="preserve">The Section 3 vuln_cache schema has no fix-date column, but 'patch lag' (days since the fix was available) requires one; maybe_upgrade re-runs dbDelta to add it. The providers file houses the one-interface / swappable-implementation requirement. Patchstack's exact API JSON couldn't be verified offline, so its parser is defensive and easy to adjust; the interface makes swapping trivial.</w:t>
+            </w:r>
+          </w:p>
+        </w:tc>
+      </w:tr>
+      <w:tr>
+        <w:tc>
+          <w:tcPr>
+            <w:tcW w:type="dxa" w:w="1400"/>
+            <w:shd w:fill="FFFFFF" w:val="clear"/>
+            <w:tcMar>
+              <w:top w:type="dxa" w:w="60"/>
+              <w:left w:type="dxa" w:w="100"/>
+              <w:bottom w:type="dxa" w:w="60"/>
+              <w:right w:type="dxa" w:w="100"/>
+            </w:tcMar>
+          </w:tcPr>
+          <w:p>
+            <w:r>
+              <w:rPr>
+                <w:b w:val="false"/>
+                <w:bCs w:val="false"/>
+                <w:color w:val="222222"/>
+                <w:sz w:val="19"/>
+                <w:szCs w:val="19"/>
+              </w:rPr>
+              <w:t xml:space="preserve">Stage 6</w:t>
+            </w:r>
+          </w:p>
+        </w:tc>
+        <w:tc>
+          <w:tcPr>
+            <w:tcW w:type="dxa" w:w="4400"/>
+            <w:shd w:fill="FFFFFF" w:val="clear"/>
+            <w:tcMar>
+              <w:top w:type="dxa" w:w="60"/>
+              <w:left w:type="dxa" w:w="100"/>
+              <w:bottom w:type="dxa" w:w="60"/>
+              <w:right w:type="dxa" w:w="100"/>
+            </w:tcMar>
+          </w:tcPr>
+          <w:p>
+            <w:r>
+              <w:rPr>
+                <w:b w:val="false"/>
+                <w:bCs w:val="false"/>
+                <w:color w:val="222222"/>
+                <w:sz w:val="19"/>
+                <w:szCs w:val="19"/>
+              </w:rPr>
+              <w:t xml:space="preserve">The digest runs on a single daily wp-cron that self-gates on the chosen frequency and the last-sent date (rather than rescheduling the cron when the frequency setting changes).</w:t>
+            </w:r>
+          </w:p>
+        </w:tc>
+        <w:tc>
+          <w:tcPr>
+            <w:tcW w:type="dxa" w:w="3200"/>
+            <w:shd w:fill="FFFFFF" w:val="clear"/>
+            <w:tcMar>
+              <w:top w:type="dxa" w:w="60"/>
+              <w:left w:type="dxa" w:w="100"/>
+              <w:bottom w:type="dxa" w:w="60"/>
+              <w:right w:type="dxa" w:w="100"/>
+            </w:tcMar>
+          </w:tcPr>
+          <w:p>
+            <w:r>
+              <w:rPr>
+                <w:b w:val="false"/>
+                <w:bCs w:val="false"/>
+                <w:color w:val="222222"/>
+                <w:sz w:val="19"/>
+                <w:szCs w:val="19"/>
+              </w:rPr>
+              <w:t xml:space="preserve">Gating one daily job is more robust than re-scheduling on every settings save: a frequency change takes effect immediately with no dangling schedules, and a weekly digest still fires roughly every 7 days regardless of when the setting changed. Behaviour (daily vs weekly) matches the brief.</w:t>
+            </w:r>
+          </w:p>
+        </w:tc>
+      </w:tr>
+      <w:tr>
+        <w:tc>
+          <w:tcPr>
+            <w:tcW w:type="dxa" w:w="1400"/>
+            <w:shd w:fill="FFFFFF" w:val="clear"/>
+            <w:tcMar>
+              <w:top w:type="dxa" w:w="60"/>
+              <w:left w:type="dxa" w:w="100"/>
+              <w:bottom w:type="dxa" w:w="60"/>
+              <w:right w:type="dxa" w:w="100"/>
+            </w:tcMar>
+          </w:tcPr>
+          <w:p>
+            <w:r>
+              <w:rPr>
+                <w:b w:val="false"/>
+                <w:bCs w:val="false"/>
+                <w:color w:val="222222"/>
+                <w:sz w:val="19"/>
+                <w:szCs w:val="19"/>
+              </w:rPr>
+              <w:t xml:space="preserve">Stage 7</w:t>
+            </w:r>
+          </w:p>
+        </w:tc>
+        <w:tc>
+          <w:tcPr>
+            <w:tcW w:type="dxa" w:w="4400"/>
+            <w:shd w:fill="FFFFFF" w:val="clear"/>
+            <w:tcMar>
+              <w:top w:type="dxa" w:w="60"/>
+              <w:left w:type="dxa" w:w="100"/>
+              <w:bottom w:type="dxa" w:w="60"/>
+              <w:right w:type="dxa" w:w="100"/>
+            </w:tcMar>
+          </w:tcPr>
+          <w:p>
+            <w:r>
+              <w:rPr>
+                <w:b w:val="false"/>
+                <w:bCs w:val="false"/>
+                <w:color w:val="222222"/>
+                <w:sz w:val="19"/>
+                <w:szCs w:val="19"/>
+              </w:rPr>
+              <w:t xml:space="preserve">The client posts to {hub_url}/wp-json/kdna-sentinel/v1/report (standard REST path) as a non-blocking fire-and-forget request, and the hub stale-check-in threshold is 2 days.</w:t>
+            </w:r>
+          </w:p>
+        </w:tc>
+        <w:tc>
+          <w:tcPr>
+            <w:tcW w:type="dxa" w:w="3200"/>
+            <w:shd w:fill="FFFFFF" w:val="clear"/>
+            <w:tcMar>
+              <w:top w:type="dxa" w:w="60"/>
+              <w:left w:type="dxa" w:w="100"/>
+              <w:bottom w:type="dxa" w:w="60"/>
+              <w:right w:type="dxa" w:w="100"/>
+            </w:tcMar>
+          </w:tcPr>
+          <w:p>
+            <w:r>
+              <w:rPr>
+                <w:b w:val="false"/>
+                <w:bCs w:val="false"/>
+                <w:color w:val="222222"/>
+                <w:sz w:val="19"/>
+                <w:szCs w:val="19"/>
+              </w:rPr>
+              <w:t xml:space="preserve">Non-blocking keeps a scan from being slowed by the hub round-trip; the HMAC is still sent and the hub logs receipt, so delivery confirmation isn't needed. The standard /wp-json/ REST base covers the vast majority of installs. 2 days matches the daily report cadence (a site that misses ~2 daily reports is genuinely stale).</w:t>
             </w:r>
           </w:p>
         </w:tc>

</xml_diff>